<commit_message>
style(reference-doc): add new Page Number style with font and size specifications
</commit_message>
<xml_diff>
--- a/reference-doc.docx
+++ b/reference-doc.docx
@@ -1856,6 +1856,14 @@
     <w:rPr>
       <w:i/>
       <w:iCs/>
+    </w:rPr>
+  </w:style>
+  <w:style w:type="character" w:styleId="af6">
+    <w:name w:val="page number"/>
+    <w:basedOn w:val="a1"/>
+    <w:rPr>
+      <w:rFonts w:ascii="Times New Roman" w:eastAsia="Times New Roman" w:hAnsi="Times New Roman"/>
+      <w:sz w:val="18"/>
     </w:rPr>
   </w:style>
 </w:styles>

</xml_diff>

<commit_message>
style(reference-doc): update Page Number style font size to 21
</commit_message>
<xml_diff>
--- a/reference-doc.docx
+++ b/reference-doc.docx
@@ -1862,8 +1862,8 @@
     <w:name w:val="page number"/>
     <w:basedOn w:val="a1"/>
     <w:rPr>
-      <w:rFonts w:ascii="Times New Roman" w:eastAsia="Times New Roman" w:hAnsi="Times New Roman"/>
-      <w:sz w:val="18"/>
+      <w:rFonts w:ascii="Times New Roman" w:hAnsi="Times New Roman"/>
+      <w:sz w:val="21"/>
     </w:rPr>
   </w:style>
 </w:styles>

</xml_diff>

<commit_message>
style(styles): update font settings for East Asian and ASCII characters
</commit_message>
<xml_diff>
--- a/reference-doc.docx
+++ b/reference-doc.docx
@@ -1184,8 +1184,7 @@
       <w:outlineLvl w:val="4"/>
     </w:pPr>
     <w:rPr>
-      <w:rFonts w:eastAsiaTheme="majorEastAsia" w:cstheme="majorBidi"/>
-      <w:color w:val="0F4761" w:themeColor="accent1" w:themeShade="BF"/>
+      <w:rFonts w:eastAsia="黑体" w:cstheme="majorBidi"/>
     </w:rPr>
   </w:style>
   <w:style w:type="paragraph" w:styleId="6">
@@ -1500,8 +1499,7 @@
     <w:uiPriority w:val="9"/>
     <w:semiHidden/>
     <w:rPr>
-      <w:rFonts w:eastAsiaTheme="majorEastAsia" w:cstheme="majorBidi"/>
-      <w:color w:val="0F4761" w:themeColor="accent1" w:themeShade="BF"/>
+      <w:rFonts w:ascii="Times New Roman" w:eastAsia="黑体" w:hAnsi="Times New Roman" w:cstheme="majorBidi"/>
     </w:rPr>
   </w:style>
   <w:style w:type="character" w:customStyle="1" w:styleId="60">

</xml_diff>

<commit_message>
style(styles): adjust font size from 32 to 28 for improved readability
</commit_message>
<xml_diff>
--- a/reference-doc.docx
+++ b/reference-doc.docx
@@ -1101,7 +1101,7 @@
     <w:rPr>
       <w:rFonts w:eastAsia="黑体" w:cstheme="majorBidi"/>
       <w:b/>
-      <w:sz w:val="32"/>
+      <w:sz w:val="28"/>
       <w:szCs w:val="40"/>
     </w:rPr>
   </w:style>
@@ -1123,7 +1123,6 @@
     <w:rPr>
       <w:rFonts w:eastAsia="黑体" w:cstheme="majorBidi"/>
       <w:b/>
-      <w:sz w:val="28"/>
       <w:szCs w:val="32"/>
     </w:rPr>
   </w:style>
@@ -1452,7 +1451,7 @@
     <w:rPr>
       <w:rFonts w:ascii="Times New Roman" w:eastAsia="黑体" w:hAnsi="Times New Roman" w:cstheme="majorBidi"/>
       <w:b/>
-      <w:sz w:val="32"/>
+      <w:sz w:val="28"/>
       <w:szCs w:val="40"/>
     </w:rPr>
   </w:style>
@@ -1465,7 +1464,6 @@
     <w:rPr>
       <w:rFonts w:ascii="Times New Roman" w:eastAsia="黑体" w:hAnsi="Times New Roman" w:cstheme="majorBidi"/>
       <w:b/>
-      <w:sz w:val="28"/>
       <w:szCs w:val="32"/>
     </w:rPr>
   </w:style>

</xml_diff>

<commit_message>
style(styles): add custom style for Table Text with specific spacing and font size
</commit_message>
<xml_diff>
--- a/reference-doc.docx
+++ b/reference-doc.docx
@@ -1863,6 +1863,17 @@
     <w:rPr>
       <w:rFonts w:ascii="Times New Roman" w:hAnsi="Times New Roman"/>
       <w:sz w:val="21"/>
+    </w:rPr>
+  </w:style>
+  <w:style w:type="paragraph" w:customStyle="1" w:styleId="TableText">
+    <w:name w:val="Table Text"/>
+    <w:basedOn w:val="a"/>
+    <w:qFormat/>
+    <w:pPr>
+      <w:spacing w:before="50" w:after="50" w:line="240" w:lineRule="auto"/>
+    </w:pPr>
+    <w:rPr>
+      <w:szCs w:val="20"/>
     </w:rPr>
   </w:style>
 </w:styles>

</xml_diff>

<commit_message>
style(styles): add custom paragraph style "Para Where" with specific indentation settings
</commit_message>
<xml_diff>
--- a/reference-doc.docx
+++ b/reference-doc.docx
@@ -1875,6 +1875,15 @@
     <w:rPr>
       <w:szCs w:val="20"/>
     </w:rPr>
+  </w:style>
+  <w:style w:type="paragraph" w:customStyle="1" w:styleId="ParaWhere">
+    <w:name w:val="Para Where"/>
+    <w:basedOn w:val="a0"/>
+    <w:next w:val="a0"/>
+    <w:qFormat/>
+    <w:pPr>
+      <w:ind w:firstLineChars="0" w:firstLine="0"/>
+    </w:pPr>
   </w:style>
 </w:styles>
 </file>

</xml_diff>

<commit_message>
style(styles): add custom paragraph style "Para After Table" with specific spacing
</commit_message>
<xml_diff>
--- a/reference-doc.docx
+++ b/reference-doc.docx
@@ -1883,6 +1883,15 @@
     <w:qFormat/>
     <w:pPr>
       <w:ind w:firstLineChars="0" w:firstLine="0"/>
+    </w:pPr>
+  </w:style>
+  <w:style w:type="paragraph" w:customStyle="1" w:styleId="ParaAfterTable">
+    <w:name w:val="Para After Table"/>
+    <w:basedOn w:val="a0"/>
+    <w:next w:val="a0"/>
+    <w:qFormat/>
+    <w:pPr>
+      <w:spacing w:before="120"/>
     </w:pPr>
   </w:style>
 </w:styles>

</xml_diff>

<commit_message>
style(reference-doc): add "Para After Table" style and update paragraph styles for tables
</commit_message>
<xml_diff>
--- a/reference-doc.docx
+++ b/reference-doc.docx
@@ -360,7 +360,7 @@
           </w:tcPr>
           <w:p>
             <w:pPr>
-              <w:pStyle w:val="Compact"/>
+              <w:pStyle w:val="TableText"/>
             </w:pPr>
             <w:r>
               <w:t>Table</w:t>
@@ -385,7 +385,7 @@
           </w:tcPr>
           <w:p>
             <w:pPr>
-              <w:pStyle w:val="Compact"/>
+              <w:pStyle w:val="TableText"/>
             </w:pPr>
             <w:r>
               <w:t>Table</w:t>
@@ -406,7 +406,7 @@
           </w:tcPr>
           <w:p>
             <w:pPr>
-              <w:pStyle w:val="Compact"/>
+              <w:pStyle w:val="TableText"/>
             </w:pPr>
             <w:r>
               <w:t>1</w:t>
@@ -431,7 +431,7 @@
           </w:tcPr>
           <w:p>
             <w:pPr>
-              <w:pStyle w:val="Compact"/>
+              <w:pStyle w:val="TableText"/>
             </w:pPr>
             <w:r>
               <w:t>2</w:t>
@@ -442,10 +442,24 @@
     </w:tbl>
     <w:p>
       <w:pPr>
+        <w:pStyle w:val="ParaAfterTable"/>
+        <w:rPr>
+          <w:rFonts w:hint="eastAsia"/>
+        </w:rPr>
+      </w:pPr>
+      <w:r>
+        <w:rPr>
+          <w:rFonts w:hint="eastAsia"/>
+        </w:rPr>
+        <w:lastRenderedPageBreak/>
+        <w:t xml:space="preserve">Para After Table </w:t>
+      </w:r>
+    </w:p>
+    <w:p>
+      <w:pPr>
         <w:pStyle w:val="ImageCaption"/>
       </w:pPr>
       <w:r>
-        <w:lastRenderedPageBreak/>
         <w:t>Image Caption</w:t>
       </w:r>
     </w:p>
@@ -484,9 +498,6 @@
     <w:p>
       <w:pPr>
         <w:pStyle w:val="af5"/>
-        <w:rPr>
-          <w:rFonts w:hint="eastAsia"/>
-        </w:rPr>
       </w:pPr>
       <w:r>
         <w:rPr>
@@ -1873,6 +1884,7 @@
       <w:spacing w:before="50" w:after="50" w:line="240" w:lineRule="auto"/>
     </w:pPr>
     <w:rPr>
+      <w:sz w:val="21"/>
       <w:szCs w:val="20"/>
     </w:rPr>
   </w:style>

</xml_diff>

<commit_message>
style(styles): add custom styles for "Image Caption English" and "Table Caption English" with Times New Roman font
</commit_message>
<xml_diff>
--- a/reference-doc.docx
+++ b/reference-doc.docx
@@ -1905,6 +1905,24 @@
     <w:pPr>
       <w:spacing w:before="120"/>
     </w:pPr>
+  </w:style>
+  <w:style w:type="paragraph" w:customStyle="1" w:styleId="ImageCaptionEnglish">
+    <w:name w:val="Image Caption English"/>
+    <w:basedOn w:val="ImageCaption"/>
+    <w:qFormat/>
+    <w:rPr>
+      <w:rFonts w:ascii="Times New Roman" w:hAnsi="Times New Roman"/>
+      <w:lang w:val="en-US"/>
+    </w:rPr>
+  </w:style>
+  <w:style w:type="paragraph" w:customStyle="1" w:styleId="TableCaptionEnglish">
+    <w:name w:val="Table Caption English"/>
+    <w:basedOn w:val="TableCaption"/>
+    <w:qFormat/>
+    <w:rPr>
+      <w:rFonts w:ascii="Times New Roman" w:hAnsi="Times New Roman"/>
+      <w:lang w:val="en-US"/>
+    </w:rPr>
   </w:style>
 </w:styles>
 </file>

</xml_diff>

<commit_message>
style(styles): enhance spacing and line settings for paragraph styles
</commit_message>
<xml_diff>
--- a/reference-doc.docx
+++ b/reference-doc.docx
@@ -1656,7 +1656,7 @@
     <w:link w:val="ad"/>
     <w:qFormat/>
     <w:pPr>
-      <w:spacing w:after="120"/>
+      <w:spacing w:after="120" w:line="240" w:lineRule="auto"/>
       <w:jc w:val="center"/>
     </w:pPr>
   </w:style>
@@ -1910,19 +1910,11 @@
     <w:name w:val="Image Caption English"/>
     <w:basedOn w:val="ImageCaption"/>
     <w:qFormat/>
-    <w:rPr>
-      <w:rFonts w:ascii="Times New Roman" w:hAnsi="Times New Roman"/>
-      <w:lang w:val="en-US"/>
-    </w:rPr>
   </w:style>
   <w:style w:type="paragraph" w:customStyle="1" w:styleId="TableCaptionEnglish">
     <w:name w:val="Table Caption English"/>
     <w:basedOn w:val="TableCaption"/>
     <w:qFormat/>
-    <w:rPr>
-      <w:rFonts w:ascii="Times New Roman" w:hAnsi="Times New Roman"/>
-      <w:lang w:val="en-US"/>
-    </w:rPr>
   </w:style>
 </w:styles>
 </file>

</xml_diff>

<commit_message>
style(styles): remove "Image Caption English" and "Table Caption English" styles; add contextual spacing to Image Caption style
</commit_message>
<xml_diff>
--- a/reference-doc.docx
+++ b/reference-doc.docx
@@ -1667,12 +1667,16 @@
     <w:pPr>
       <w:keepNext/>
       <w:spacing w:after="0"/>
+      <w:contextualSpacing/>
     </w:pPr>
   </w:style>
   <w:style w:type="paragraph" w:customStyle="1" w:styleId="ImageCaption">
     <w:name w:val="Image Caption"/>
     <w:basedOn w:val="ac"/>
     <w:qFormat/>
+    <w:pPr>
+      <w:contextualSpacing/>
+    </w:pPr>
   </w:style>
   <w:style w:type="paragraph" w:customStyle="1" w:styleId="Figure">
     <w:name w:val="Figure"/>
@@ -1905,16 +1909,6 @@
     <w:pPr>
       <w:spacing w:before="120"/>
     </w:pPr>
-  </w:style>
-  <w:style w:type="paragraph" w:customStyle="1" w:styleId="ImageCaptionEnglish">
-    <w:name w:val="Image Caption English"/>
-    <w:basedOn w:val="ImageCaption"/>
-    <w:qFormat/>
-  </w:style>
-  <w:style w:type="paragraph" w:customStyle="1" w:styleId="TableCaptionEnglish">
-    <w:name w:val="Table Caption English"/>
-    <w:basedOn w:val="TableCaption"/>
-    <w:qFormat/>
   </w:style>
 </w:styles>
 </file>

</xml_diff>

<commit_message>
style(styles): comment out semiHidden and unhideWhenUsed for Table style; add new TableNoBorder style with specific spacing and font settings
</commit_message>
<xml_diff>
--- a/reference-doc.docx
+++ b/reference-doc.docx
@@ -1596,8 +1596,8 @@
   </w:style>
   <w:style w:type="table" w:customStyle="1" w:styleId="Table">
     <w:name w:val="Table"/>
-    <w:semiHidden/>
-    <w:unhideWhenUsed/>
+    <!-- <w:semiHidden /> -->
+    <!-- <w:unhideWhenUsed /> -->
     <w:qFormat/>
     <w:rPr>
       <w:sz w:val="21"/>
@@ -1909,6 +1909,19 @@
     <w:pPr>
       <w:spacing w:before="120"/>
     </w:pPr>
+  </w:style>
+  <w:style w:type="table" w:customStyle="1" w:styleId="TableNoBorder">
+    <w:name w:val="Table NoBorder"/>
+    <w:basedOn w:val="a2"/>
+    <w:uiPriority w:val="99"/>
+    <w:pPr>
+      <w:spacing w:after="0"/>
+    </w:pPr>
+    <w:rPr>
+      <w:rFonts w:ascii="Times New Roman" w:eastAsia="宋体" w:hAnsi="Times New Roman"/>
+      <w:sz w:val="21"/>
+    </w:rPr>
+    <w:tblPr/>
   </w:style>
 </w:styles>
 </file>

</xml_diff>

<commit_message>
style(styles): add new TableSubfigure and Table Grid styles with specific properties
</commit_message>
<xml_diff>
--- a/reference-doc.docx
+++ b/reference-doc.docx
@@ -1922,6 +1922,44 @@
       <w:sz w:val="21"/>
     </w:rPr>
     <w:tblPr/>
+  </w:style>
+  <w:style w:type="table" w:customStyle="1" w:styleId="TableSubfigure">
+    <w:name w:val="TableSubfigure"/>
+    <w:basedOn w:val="a2"/>
+    <w:uiPriority w:val="99"/>
+    <w:pPr>
+      <w:spacing w:after="0"/>
+    </w:pPr>
+    <w:tblPr>
+      <w:jc w:val="center"/>
+      <w:tblCellMar>
+        <w:left w:w="0" w:type="dxa"/>
+        <w:right w:w="0" w:type="dxa"/>
+      </w:tblCellMar>
+    </w:tblPr>
+    <w:trPr>
+      <w:jc w:val="center"/>
+    </w:trPr>
+    <w:tcPr>
+      <w:vAlign w:val="center"/>
+    </w:tcPr>
+  </w:style>
+  <w:style w:type="table" w:styleId="af7">
+    <w:name w:val="Table Grid"/>
+    <w:basedOn w:val="a2"/>
+    <w:pPr>
+      <w:spacing w:after="0"/>
+    </w:pPr>
+    <w:tblPr>
+      <w:tblBorders>
+        <w:top w:val="single" w:sz="4" w:space="0" w:color="auto"/>
+        <w:left w:val="single" w:sz="4" w:space="0" w:color="auto"/>
+        <w:bottom w:val="single" w:sz="4" w:space="0" w:color="auto"/>
+        <w:right w:val="single" w:sz="4" w:space="0" w:color="auto"/>
+        <w:insideH w:val="single" w:sz="4" w:space="0" w:color="auto"/>
+        <w:insideV w:val="single" w:sz="4" w:space="0" w:color="auto"/>
+      </w:tblBorders>
+    </w:tblPr>
   </w:style>
 </w:styles>
 </file>

</xml_diff>

<commit_message>
style(styles): remove Table Grid style to streamline table formatting options
</commit_message>
<xml_diff>
--- a/reference-doc.docx
+++ b/reference-doc.docx
@@ -1943,23 +1943,6 @@
     <w:tcPr>
       <w:vAlign w:val="center"/>
     </w:tcPr>
-  </w:style>
-  <w:style w:type="table" w:styleId="af7">
-    <w:name w:val="Table Grid"/>
-    <w:basedOn w:val="a2"/>
-    <w:pPr>
-      <w:spacing w:after="0"/>
-    </w:pPr>
-    <w:tblPr>
-      <w:tblBorders>
-        <w:top w:val="single" w:sz="4" w:space="0" w:color="auto"/>
-        <w:left w:val="single" w:sz="4" w:space="0" w:color="auto"/>
-        <w:bottom w:val="single" w:sz="4" w:space="0" w:color="auto"/>
-        <w:right w:val="single" w:sz="4" w:space="0" w:color="auto"/>
-        <w:insideH w:val="single" w:sz="4" w:space="0" w:color="auto"/>
-        <w:insideV w:val="single" w:sz="4" w:space="0" w:color="auto"/>
-      </w:tblBorders>
-    </w:tblPr>
   </w:style>
 </w:styles>
 </file>

</xml_diff>

<commit_message>
style(styles): adjust spacing properties for Table style and related styles
</commit_message>
<xml_diff>
--- a/reference-doc.docx
+++ b/reference-doc.docx
@@ -1596,8 +1596,6 @@
   </w:style>
   <w:style w:type="table" w:customStyle="1" w:styleId="Table">
     <w:name w:val="Table"/>
-    <!-- <w:semiHidden /> -->
-    <!-- <w:unhideWhenUsed /> -->
     <w:qFormat/>
     <w:rPr>
       <w:sz w:val="21"/>
@@ -1656,7 +1654,7 @@
     <w:link w:val="ad"/>
     <w:qFormat/>
     <w:pPr>
-      <w:spacing w:after="120" w:line="240" w:lineRule="auto"/>
+      <w:spacing w:after="0" w:line="240" w:lineRule="auto"/>
       <w:jc w:val="center"/>
     </w:pPr>
   </w:style>
@@ -1666,7 +1664,7 @@
     <w:qFormat/>
     <w:pPr>
       <w:keepNext/>
-      <w:spacing w:after="0"/>
+      <w:spacing w:before="120" w:after="40"/>
       <w:contextualSpacing/>
     </w:pPr>
   </w:style>
@@ -1675,6 +1673,7 @@
     <w:basedOn w:val="ac"/>
     <w:qFormat/>
     <w:pPr>
+      <w:spacing w:after="120"/>
       <w:contextualSpacing/>
     </w:pPr>
   </w:style>

</xml_diff>

<commit_message>
style(styles): add new custom paragraph style "式中" based on TableText with specific font size
</commit_message>
<xml_diff>
--- a/reference-doc.docx
+++ b/reference-doc.docx
@@ -1942,6 +1942,16 @@
     <w:tcPr>
       <w:vAlign w:val="center"/>
     </w:tcPr>
+  </w:style>
+  <w:style w:type="paragraph" w:customStyle="1" w:styleId="af7">
+    <w:name w:val="式中"/>
+    <w:basedOn w:val="a0"/>
+    <w:next w:val="a0"/>
+    <w:qFormat/>
+    <w:pPr>
+      <w:spacing w:before="0" w:after="0"/>
+      <w:ind w:firstLineChars="0" w:firstLine="0"/>
+    </w:pPr>
   </w:style>
 </w:styles>
 </file>

</xml_diff>

<commit_message>
style(styles): add new custom paragraph style "Bracketed List" based on Compact with hanging indentation
</commit_message>
<xml_diff>
--- a/reference-doc.docx
+++ b/reference-doc.docx
@@ -1328,6 +1328,15 @@
     <w:pPr>
       <w:spacing w:before="36" w:after="36"/>
       <w:ind w:firstLineChars="0" w:firstLine="0"/>
+    </w:pPr>
+  </w:style>
+  <w:style w:type="paragraph" w:customStyle="1" w:styleId="BracketedList">
+    <w:name w:val="Bracketed List"/>
+    <w:basedOn w:val="Compact"/>
+    <w:next w:val="BracketedList"/>
+    <w:qFormat/>
+    <w:pPr>
+      <w:ind w:hangingChars="200"/>
     </w:pPr>
   </w:style>
   <w:style w:type="paragraph" w:styleId="a4">

</xml_diff>

<commit_message>
Style of table of figures
</commit_message>
<xml_diff>
--- a/reference-doc.docx
+++ b/reference-doc.docx
@@ -2421,6 +2421,14 @@
     <w:rPr>
       <w:sz w:val="24"/>
     </w:rPr>
+  </w:style>
+  <w:style w:type="paragraph" w:styleId="af8">
+    <w:name w:val="table of figures"/>
+    <w:basedOn w:val="a"/>
+    <w:next w:val="a"/>
+    <w:pPr>
+      <w:ind w:left="200" w:hangingChars="200" w:hanging="200"/>
+    </w:pPr>
   </w:style>
 </w:styles>
 </file>

</xml_diff>

<commit_message>
style(styles): add custom paragraph styles for Author, Affiliation, and Correspondence
</commit_message>
<xml_diff>
--- a/reference-doc.docx
+++ b/reference-doc.docx
@@ -1808,15 +1808,63 @@
   </w:style>
   <w:style w:type="paragraph" w:customStyle="1" w:styleId="Author">
     <w:name w:val="Author"/>
-    <w:basedOn w:val="a4"/>
+    <w:basedOn w:val="a0"/>
     <w:next w:val="a0"/>
     <w:pPr>
       <w:keepNext/>
       <w:keepLines/>
-    </w:pPr>
-    <w:rPr>
+      <!-- Match the pre-filter author paragraph instead of inheriting Body Text's 9pt space before. -->
+      <w:spacing w:before="0"/>
+      <w:jc w:val="center"/>
+      <w:ind w:firstLine="0" w:firstLineChars="0"/>
+    </w:pPr>
+    <w:rPr>
+      <w:rFonts w:ascii="Times New Roman" w:hAnsi="Times New Roman" w:eastAsia="Times New Roman"/>
       <w:sz w:val="24"/>
       <w:szCs w:val="24"/>
+    </w:rPr>
+  </w:style>
+  <w:style w:type="paragraph" w:customStyle="1" w:styleId="Affiliation">
+    <w:name w:val="Affiliation"/>
+    <!-- Preserve the pre-filter Normal ancestry and inherited East Asian typography. -->
+    <w:basedOn w:val="a"/>
+    <w:uiPriority w:val="1"/>
+    <w:qFormat/>
+    <w:pPr>
+      <w:spacing w:before="120" w:after="120"/>
+      <w:jc w:val="center"/>
+    </w:pPr>
+    <w:rPr>
+      <w:rFonts w:ascii="Times New Roman" w:hAnsi="Times New Roman"/>
+      <w:i/>
+      <w:sz w:val="20"/>
+    </w:rPr>
+  </w:style>
+  <w:style w:type="character" w:customStyle="1" w:styleId="CorrespondenceText">
+    <w:name w:val="Correspondence Text"/>
+    <w:qFormat/>
+    <w:rPr>
+      <w:rFonts w:ascii="Times New Roman" w:hAnsi="Times New Roman" w:eastAsia="Times New Roman"/>
+      <w:i/>
+      <w:sz w:val="20"/>
+      <w:szCs w:val="20"/>
+    </w:rPr>
+  </w:style>
+  <w:style w:type="paragraph" w:customStyle="1" w:styleId="Correspondence">
+    <w:name w:val="Correspondence"/>
+    <w:basedOn w:val="a0"/>
+    <w:next w:val="a0"/>
+    <w:qFormat/>
+    <w:pPr>
+      <w:spacing w:before="0" w:after="0"/>
+      <w:ind w:firstLine="0" w:firstLineChars="0"/>
+      <w:jc w:val="left"/>
+    </w:pPr>
+    <w:rPr>
+      <w:rFonts w:ascii="Times New Roman" w:hAnsi="Times New Roman" w:eastAsia="Times New Roman"/>
+      <w:i/>
+      <w:sz w:val="20"/>
+      <w:szCs w:val="20"/>
     </w:rPr>
   </w:style>
   <w:style w:type="paragraph" w:styleId="a8">

</xml_diff>

<commit_message>
style(styles): update uiPriority for various styles and add new "Para Equation" style
</commit_message>
<xml_diff>
--- a/reference-doc.docx
+++ b/reference-doc.docx
@@ -1238,11 +1238,11 @@
       </w:pPr>
     </w:pPrDefault>
   </w:docDefaults>
-  <w:latentStyles w:defLockedState="0" w:defUIPriority="0" w:defSemiHidden="0" w:defUnhideWhenUsed="0" w:defQFormat="0" w:count="376">
+  <w:latentStyles w:defLockedState="0" w:defUIPriority="99" w:defSemiHidden="0" w:defUnhideWhenUsed="0" w:defQFormat="0" w:count="376">
     <w:lsdException w:name="toc 1" w:uiPriority="39"/>
     <w:lsdException w:name="toc 2" w:uiPriority="39"/>
     <w:lsdException w:name="toc 3" w:uiPriority="39"/>
-    <w:lsdException w:name="caption" w:qFormat="1"/>
+    <w:lsdException w:name="caption" w:uiPriority="9" w:qFormat="1"/>
     <w:lsdException w:name="Hyperlink" w:uiPriority="99"/>
     <w:lsdException w:name="Normal Table" w:semiHidden="1" w:unhideWhenUsed="1"/>
     <w:lsdException w:name="Table Simple 1" w:semiHidden="1" w:unhideWhenUsed="1"/>
@@ -1308,7 +1308,7 @@
     <w:lsdException w:name="Medium Shading 1 Accent 1"/>
     <w:lsdException w:name="Medium Shading 2 Accent 1"/>
     <w:lsdException w:name="Medium List 1 Accent 1"/>
-    <w:lsdException w:name="Quote" w:qFormat="1"/>
+    <w:lsdException w:name="Quote" w:semiHidden="1" w:uiPriority="99" w:unhideWhenUsed="1" w:qFormat="1"/>
     <w:lsdException w:name="Medium List 2 Accent 1"/>
     <w:lsdException w:name="Medium Grid 1 Accent 1"/>
     <w:lsdException w:name="Medium Grid 2 Accent 1"/>
@@ -1490,6 +1490,7 @@
   </w:latentStyles>
   <w:style w:type="paragraph" w:default="1" w:styleId="a">
     <w:name w:val="Normal"/>
+    <w:uiPriority w:val="99"/>
     <w:qFormat/>
     <w:pPr>
       <w:spacing w:after="0" w:line="360" w:lineRule="auto"/>
@@ -1506,7 +1507,7 @@
     <w:basedOn w:val="a"/>
     <w:next w:val="a0"/>
     <w:link w:val="10"/>
-    <w:uiPriority w:val="9"/>
+    <w:uiPriority w:val="2"/>
     <w:qFormat/>
     <w:pPr>
       <w:keepNext/>
@@ -1526,9 +1527,7 @@
     <w:basedOn w:val="a"/>
     <w:next w:val="a0"/>
     <w:link w:val="20"/>
-    <w:uiPriority w:val="9"/>
-    <w:semiHidden/>
-    <w:unhideWhenUsed/>
+    <w:uiPriority w:val="3"/>
     <w:qFormat/>
     <w:pPr>
       <w:keepNext/>
@@ -1547,9 +1546,7 @@
     <w:basedOn w:val="a"/>
     <w:next w:val="a0"/>
     <w:link w:val="30"/>
-    <w:uiPriority w:val="9"/>
-    <w:semiHidden/>
-    <w:unhideWhenUsed/>
+    <w:uiPriority w:val="4"/>
     <w:qFormat/>
     <w:pPr>
       <w:keepNext/>
@@ -1568,7 +1565,7 @@
     <w:basedOn w:val="a"/>
     <w:next w:val="a0"/>
     <w:link w:val="40"/>
-    <w:uiPriority w:val="9"/>
+    <w:uiPriority w:val="15"/>
     <w:semiHidden/>
     <w:unhideWhenUsed/>
     <w:qFormat/>
@@ -1588,7 +1585,7 @@
     <w:basedOn w:val="a"/>
     <w:next w:val="a0"/>
     <w:link w:val="50"/>
-    <w:uiPriority w:val="9"/>
+    <w:uiPriority w:val="15"/>
     <w:semiHidden/>
     <w:unhideWhenUsed/>
     <w:qFormat/>
@@ -1607,7 +1604,7 @@
     <w:basedOn w:val="a"/>
     <w:next w:val="a0"/>
     <w:link w:val="60"/>
-    <w:uiPriority w:val="9"/>
+    <w:uiPriority w:val="15"/>
     <w:semiHidden/>
     <w:unhideWhenUsed/>
     <w:qFormat/>
@@ -1629,7 +1626,7 @@
     <w:basedOn w:val="a"/>
     <w:next w:val="a0"/>
     <w:link w:val="70"/>
-    <w:uiPriority w:val="9"/>
+    <w:uiPriority w:val="15"/>
     <w:semiHidden/>
     <w:unhideWhenUsed/>
     <w:qFormat/>
@@ -1649,7 +1646,7 @@
     <w:basedOn w:val="a"/>
     <w:next w:val="a0"/>
     <w:link w:val="80"/>
-    <w:uiPriority w:val="9"/>
+    <w:uiPriority w:val="15"/>
     <w:semiHidden/>
     <w:unhideWhenUsed/>
     <w:qFormat/>
@@ -1671,7 +1668,7 @@
     <w:basedOn w:val="a"/>
     <w:next w:val="a0"/>
     <w:link w:val="90"/>
-    <w:uiPriority w:val="9"/>
+    <w:uiPriority w:val="15"/>
     <w:semiHidden/>
     <w:unhideWhenUsed/>
     <w:qFormat/>
@@ -1688,7 +1685,7 @@
   </w:style>
   <w:style w:type="character" w:default="1" w:styleId="a1">
     <w:name w:val="Default Paragraph Font"/>
-    <w:uiPriority w:val="1"/>
+    <w:uiPriority w:val="15"/>
     <w:semiHidden/>
     <w:unhideWhenUsed/>
   </w:style>
@@ -1716,6 +1713,7 @@
   <w:style w:type="paragraph" w:styleId="a0">
     <w:name w:val="Body Text"/>
     <w:basedOn w:val="a"/>
+    <w:uiPriority w:val="1"/>
     <w:qFormat/>
     <w:pPr>
       <w:spacing w:before="180" w:after="180"/>
@@ -1739,6 +1737,9 @@
     <w:name w:val="Bracketed List"/>
     <w:basedOn w:val="Compact"/>
     <w:next w:val="BracketedList"/>
+    <w:uiPriority w:val="11"/>
+    <w:semiHidden/>
+    <w:unhideWhenUsed/>
     <w:qFormat/>
     <w:pPr>
       <w:ind w:hangingChars="200"/>
@@ -1749,7 +1750,7 @@
     <w:basedOn w:val="a"/>
     <w:next w:val="a0"/>
     <w:link w:val="a5"/>
-    <w:uiPriority w:val="10"/>
+    <w:uiPriority w:val="15"/>
     <w:qFormat/>
     <w:pPr>
       <w:spacing w:after="80"/>
@@ -1767,7 +1768,7 @@
     <w:name w:val="标题 字符"/>
     <w:basedOn w:val="a1"/>
     <w:link w:val="a4"/>
-    <w:uiPriority w:val="10"/>
+    <w:uiPriority w:val="15"/>
     <w:rPr>
       <w:rFonts w:ascii="Times New Roman" w:eastAsia="黑体" w:hAnsi="Times New Roman" w:cstheme="majorBidi"/>
       <w:b/>
@@ -1780,7 +1781,7 @@
     <w:basedOn w:val="a4"/>
     <w:next w:val="a0"/>
     <w:link w:val="a7"/>
-    <w:uiPriority w:val="11"/>
+    <w:uiPriority w:val="15"/>
     <w:qFormat/>
     <w:pPr>
       <w:numPr>
@@ -1797,7 +1798,7 @@
     <w:name w:val="副标题 字符"/>
     <w:basedOn w:val="a1"/>
     <w:link w:val="a6"/>
-    <w:uiPriority w:val="11"/>
+    <w:uiPriority w:val="15"/>
     <w:rPr>
       <w:rFonts w:eastAsiaTheme="majorEastAsia" w:cstheme="majorBidi"/>
       <w:color w:val="595959" w:themeColor="text1" w:themeTint="A6"/>
@@ -1828,7 +1829,7 @@
     <w:name w:val="Affiliation"/>
     <!-- Preserve the pre-filter Normal ancestry and inherited East Asian typography. -->
     <w:basedOn w:val="a"/>
-    <w:uiPriority w:val="1"/>
+    <w:uiPriority w:val="15"/>
     <w:qFormat/>
     <w:pPr>
       <w:spacing w:before="120" w:after="120"/>
@@ -1910,6 +1911,8 @@
   <w:style w:type="paragraph" w:styleId="a9">
     <w:name w:val="Bibliography"/>
     <w:basedOn w:val="a"/>
+    <w:semiHidden/>
+    <w:unhideWhenUsed/>
     <w:qFormat/>
     <w:pPr>
       <w:spacing w:after="0"/>
@@ -1920,7 +1923,7 @@
     <w:name w:val="标题 1 字符"/>
     <w:basedOn w:val="a1"/>
     <w:link w:val="1"/>
-    <w:uiPriority w:val="9"/>
+    <w:uiPriority w:val="15"/>
     <w:rPr>
       <w:rFonts w:ascii="Times New Roman" w:eastAsia="黑体" w:hAnsi="Times New Roman" w:cstheme="majorBidi"/>
       <w:b/>
@@ -1932,7 +1935,7 @@
     <w:name w:val="标题 2 字符"/>
     <w:basedOn w:val="a1"/>
     <w:link w:val="2"/>
-    <w:uiPriority w:val="9"/>
+    <w:uiPriority w:val="15"/>
     <w:semiHidden/>
     <w:rPr>
       <w:rFonts w:ascii="Times New Roman" w:eastAsia="黑体" w:hAnsi="Times New Roman" w:cstheme="majorBidi"/>
@@ -1944,7 +1947,7 @@
     <w:name w:val="标题 3 字符"/>
     <w:basedOn w:val="a1"/>
     <w:link w:val="3"/>
-    <w:uiPriority w:val="9"/>
+    <w:uiPriority w:val="15"/>
     <w:semiHidden/>
     <w:rPr>
       <w:rFonts w:ascii="Times New Roman" w:eastAsia="黑体" w:hAnsi="Times New Roman" w:cstheme="majorBidi"/>
@@ -1956,7 +1959,7 @@
     <w:name w:val="标题 4 字符"/>
     <w:basedOn w:val="a1"/>
     <w:link w:val="4"/>
-    <w:uiPriority w:val="9"/>
+    <w:uiPriority w:val="15"/>
     <w:semiHidden/>
     <w:rPr>
       <w:rFonts w:ascii="Times New Roman" w:eastAsia="宋体" w:hAnsi="Times New Roman" w:cstheme="majorBidi"/>
@@ -1967,7 +1970,7 @@
     <w:name w:val="标题 5 字符"/>
     <w:basedOn w:val="a1"/>
     <w:link w:val="5"/>
-    <w:uiPriority w:val="9"/>
+    <w:uiPriority w:val="15"/>
     <w:semiHidden/>
     <w:rPr>
       <w:rFonts w:ascii="Times New Roman" w:eastAsia="黑体" w:hAnsi="Times New Roman" w:cstheme="majorBidi"/>
@@ -1977,7 +1980,7 @@
     <w:name w:val="标题 6 字符"/>
     <w:basedOn w:val="a1"/>
     <w:link w:val="6"/>
-    <w:uiPriority w:val="9"/>
+    <w:uiPriority w:val="15"/>
     <w:semiHidden/>
     <w:rPr>
       <w:rFonts w:eastAsiaTheme="majorEastAsia" w:cstheme="majorBidi"/>
@@ -1990,7 +1993,7 @@
     <w:name w:val="标题 7 字符"/>
     <w:basedOn w:val="a1"/>
     <w:link w:val="7"/>
-    <w:uiPriority w:val="9"/>
+    <w:uiPriority w:val="15"/>
     <w:semiHidden/>
     <w:rPr>
       <w:rFonts w:eastAsiaTheme="majorEastAsia" w:cstheme="majorBidi"/>
@@ -2001,7 +2004,7 @@
     <w:name w:val="标题 8 字符"/>
     <w:basedOn w:val="a1"/>
     <w:link w:val="8"/>
-    <w:uiPriority w:val="9"/>
+    <w:uiPriority w:val="15"/>
     <w:semiHidden/>
     <w:rPr>
       <w:rFonts w:eastAsiaTheme="majorEastAsia" w:cstheme="majorBidi"/>
@@ -2014,7 +2017,7 @@
     <w:name w:val="标题 9 字符"/>
     <w:basedOn w:val="a1"/>
     <w:link w:val="9"/>
-    <w:uiPriority w:val="9"/>
+    <w:uiPriority w:val="15"/>
     <w:semiHidden/>
     <w:rPr>
       <w:rFonts w:eastAsiaTheme="majorEastAsia" w:cstheme="majorBidi"/>
@@ -2025,7 +2028,7 @@
     <w:name w:val="Block Text"/>
     <w:basedOn w:val="a0"/>
     <w:next w:val="a0"/>
-    <w:uiPriority w:val="9"/>
+    <w:uiPriority w:val="15"/>
     <w:unhideWhenUsed/>
     <w:pPr>
       <w:spacing w:before="100" w:after="100"/>
@@ -2035,7 +2038,7 @@
   <w:style w:type="paragraph" w:styleId="ab">
     <w:name w:val="footnote text"/>
     <w:basedOn w:val="a"/>
-    <w:uiPriority w:val="9"/>
+    <w:uiPriority w:val="15"/>
     <w:unhideWhenUsed/>
     <w:qFormat/>
     <w:pPr>
@@ -2049,7 +2052,7 @@
     <w:name w:val="Footnote Block Text"/>
     <w:basedOn w:val="ab"/>
     <w:next w:val="ab"/>
-    <w:uiPriority w:val="9"/>
+    <w:uiPriority w:val="15"/>
     <w:unhideWhenUsed/>
     <w:pPr>
       <w:spacing w:before="100" w:after="100"/>
@@ -2114,6 +2117,7 @@
     <w:name w:val="caption"/>
     <w:basedOn w:val="a"/>
     <w:link w:val="ad"/>
+    <w:uiPriority w:val="9"/>
     <w:qFormat/>
     <w:pPr>
       <w:spacing w:after="0" w:line="240" w:lineRule="auto"/>
@@ -2123,6 +2127,7 @@
   <w:style w:type="paragraph" w:customStyle="1" w:styleId="TableCaption">
     <w:name w:val="Table Caption"/>
     <w:basedOn w:val="ac"/>
+    <w:uiPriority w:val="7"/>
     <w:qFormat/>
     <w:pPr>
       <w:keepNext/>
@@ -2133,6 +2138,7 @@
   <w:style w:type="paragraph" w:customStyle="1" w:styleId="ImageCaption">
     <w:name w:val="Image Caption"/>
     <w:basedOn w:val="ac"/>
+    <w:uiPriority w:val="6"/>
     <w:qFormat/>
     <w:pPr>
       <w:spacing w:after="120"/>
@@ -2142,6 +2148,7 @@
   <w:style w:type="paragraph" w:customStyle="1" w:styleId="Figure">
     <w:name w:val="Figure"/>
     <w:basedOn w:val="a"/>
+    <w:uiPriority w:val="5"/>
     <w:qFormat/>
     <w:pPr>
       <w:spacing w:after="0"/>
@@ -2200,8 +2207,7 @@
     <w:name w:val="TOC Heading"/>
     <w:basedOn w:val="1"/>
     <w:next w:val="a0"/>
-    <w:uiPriority w:val="39"/>
-    <w:unhideWhenUsed/>
+    <w:uiPriority w:val="10"/>
     <w:qFormat/>
     <w:pPr>
       <w:spacing w:before="240" w:line="259" w:lineRule="auto"/>
@@ -2274,7 +2280,9 @@
   <w:style w:type="character" w:customStyle="1" w:styleId="EmphasisChar">
     <w:name w:val="Emphasis Char"/>
     <w:basedOn w:val="a1"/>
-    <w:uiPriority w:val="1"/>
+    <w:uiPriority w:val="15"/>
+    <w:semiHidden/>
+    <w:unhideWhenUsed/>
     <w:qFormat/>
     <w:rPr>
       <w:i/>
@@ -2300,7 +2308,9 @@
   </w:style>
   <w:style w:type="character" w:customStyle="1" w:styleId="ReplyChar">
     <w:name w:val="Reply Char"/>
-    <w:uiPriority w:val="1"/>
+    <w:uiPriority w:val="15"/>
+    <w:semiHidden/>
+    <w:unhideWhenUsed/>
     <w:qFormat/>
     <w:rPr>
       <w:color w:val="0000FF"/>
@@ -2309,7 +2319,9 @@
   <w:style w:type="character" w:customStyle="1" w:styleId="RevisionChar">
     <w:name w:val="Revision Char"/>
     <w:basedOn w:val="a1"/>
-    <w:uiPriority w:val="1"/>
+    <w:uiPriority w:val="15"/>
+    <w:semiHidden/>
+    <w:unhideWhenUsed/>
     <w:qFormat/>
     <w:rPr>
       <w:color w:val="EE0000"/>
@@ -2328,6 +2340,8 @@
     <w:basedOn w:val="a"/>
     <w:next w:val="a"/>
     <w:link w:val="af6"/>
+    <w:semiHidden/>
+    <w:unhideWhenUsed/>
     <w:qFormat/>
     <w:rPr>
       <w:i/>
@@ -2345,6 +2359,7 @@
   <w:style w:type="paragraph" w:customStyle="1" w:styleId="TableText">
     <w:name w:val="Table Text"/>
     <w:basedOn w:val="a"/>
+    <w:uiPriority w:val="8"/>
     <w:qFormat/>
     <w:pPr>
       <w:spacing w:before="50" w:after="50" w:line="240" w:lineRule="auto"/>
@@ -2358,6 +2373,7 @@
     <w:name w:val="Para Where"/>
     <w:basedOn w:val="a0"/>
     <w:next w:val="a0"/>
+    <w:uiPriority w:val="14"/>
     <w:qFormat/>
     <w:pPr>
       <w:ind w:firstLineChars="0" w:firstLine="0"/>
@@ -2367,10 +2383,18 @@
     <w:name w:val="Para After Table"/>
     <w:basedOn w:val="a0"/>
     <w:next w:val="a0"/>
+    <w:uiPriority w:val="12"/>
     <w:qFormat/>
     <w:pPr>
       <w:spacing w:before="120"/>
     </w:pPr>
+  </w:style>
+  <w:style w:type="paragraph" w:customStyle="1" w:styleId="ParaEquation">
+    <w:name w:val="Para Equation"/>
+    <w:basedOn w:val="a0"/>
+    <w:next w:val="a0"/>
+    <w:uiPriority w:val="13"/>
+    <w:qFormat/>
   </w:style>
   <w:style w:type="table" w:customStyle="1" w:styleId="TableNoBorder">
     <w:name w:val="TableNoBorder"/>
@@ -2410,6 +2434,8 @@
     <w:name w:val="式中"/>
     <w:basedOn w:val="a0"/>
     <w:next w:val="a0"/>
+    <w:semiHidden/>
+    <w:unhideWhenUsed/>
     <w:qFormat/>
     <w:pPr>
       <w:spacing w:before="0" w:after="0"/>

</xml_diff>

<commit_message>
style(styles): add uiPriority to various paragraph and character styles
</commit_message>
<xml_diff>
--- a/reference-doc.docx
+++ b/reference-doc.docx
@@ -1723,11 +1723,13 @@
     <w:name w:val="First Paragraph"/>
     <w:basedOn w:val="a0"/>
     <w:next w:val="a0"/>
+    <w:uiPriority w:val="99"/>
     <w:qFormat/>
   </w:style>
   <w:style w:type="paragraph" w:customStyle="1" w:styleId="Compact">
     <w:name w:val="Compact"/>
     <w:basedOn w:val="a0"/>
+    <w:uiPriority w:val="99"/>
     <w:pPr>
       <w:spacing w:before="36" w:after="36"/>
       <w:ind w:firstLineChars="0" w:firstLine="0"/>
@@ -1811,6 +1813,7 @@
     <w:name w:val="Author"/>
     <w:basedOn w:val="a0"/>
     <w:next w:val="a0"/>
+    <w:uiPriority w:val="99"/>
     <w:pPr>
       <w:keepNext/>
       <w:keepLines/>
@@ -1843,6 +1846,7 @@
   </w:style>
   <w:style w:type="character" w:customStyle="1" w:styleId="CorrespondenceText">
     <w:name w:val="Correspondence Text"/>
+    <w:uiPriority w:val="99"/>
     <w:qFormat/>
     <w:rPr>
       <w:rFonts w:ascii="Times New Roman" w:hAnsi="Times New Roman" w:eastAsia="Times New Roman"/>
@@ -1855,6 +1859,7 @@
     <w:name w:val="Correspondence"/>
     <w:basedOn w:val="a0"/>
     <w:next w:val="a0"/>
+    <w:uiPriority w:val="99"/>
     <w:qFormat/>
     <w:pPr>
       <w:spacing w:before="0" w:after="0"/>
@@ -1872,6 +1877,7 @@
     <w:name w:val="Date"/>
     <w:basedOn w:val="a4"/>
     <w:next w:val="a0"/>
+    <w:uiPriority w:val="99"/>
     <w:pPr>
       <w:keepNext/>
       <w:keepLines/>
@@ -1885,6 +1891,7 @@
     <w:name w:val="Abstract Title"/>
     <w:basedOn w:val="a"/>
     <w:next w:val="Abstract"/>
+    <w:uiPriority w:val="99"/>
     <w:pPr>
       <w:keepNext/>
       <w:keepLines/>
@@ -1900,6 +1907,7 @@
     <w:name w:val="Abstract"/>
     <w:basedOn w:val="a"/>
     <w:next w:val="a0"/>
+    <w:uiPriority w:val="99"/>
     <w:pPr>
       <w:keepNext/>
       <w:spacing w:before="100" w:after="120"/>
@@ -1911,6 +1919,7 @@
   <w:style w:type="paragraph" w:styleId="a9">
     <w:name w:val="Bibliography"/>
     <w:basedOn w:val="a"/>
+    <w:uiPriority w:val="99"/>
     <w:semiHidden/>
     <w:unhideWhenUsed/>
     <w:qFormat/>
@@ -2061,6 +2070,7 @@
   </w:style>
   <w:style w:type="table" w:customStyle="1" w:styleId="Table">
     <w:name w:val="Table"/>
+    <w:uiPriority w:val="99"/>
     <w:qFormat/>
     <w:rPr>
       <w:sz w:val="21"/>
@@ -2100,6 +2110,7 @@
     <w:name w:val="Definition Term"/>
     <w:basedOn w:val="a"/>
     <w:next w:val="Definition"/>
+    <w:uiPriority w:val="99"/>
     <w:pPr>
       <w:keepNext/>
       <w:keepLines/>
@@ -2112,6 +2123,7 @@
   <w:style w:type="paragraph" w:customStyle="1" w:styleId="Definition">
     <w:name w:val="Definition"/>
     <w:basedOn w:val="a"/>
+    <w:uiPriority w:val="99"/>
   </w:style>
   <w:style w:type="paragraph" w:styleId="ac">
     <w:name w:val="caption"/>
@@ -2159,6 +2171,7 @@
   <w:style w:type="paragraph" w:customStyle="1" w:styleId="CaptionedFigure">
     <w:name w:val="Captioned Figure"/>
     <w:basedOn w:val="Figure"/>
+    <w:uiPriority w:val="99"/>
     <w:qFormat/>
     <w:pPr>
       <w:keepNext/>
@@ -2168,6 +2181,7 @@
     <w:name w:val="题注 字符"/>
     <w:basedOn w:val="a1"/>
     <w:link w:val="ac"/>
+    <w:uiPriority w:val="99"/>
     <w:rPr>
       <w:rFonts w:ascii="Times New Roman" w:eastAsia="宋体" w:hAnsi="Times New Roman"/>
     </w:rPr>
@@ -2175,6 +2189,7 @@
   <w:style w:type="character" w:customStyle="1" w:styleId="VerbatimChar">
     <w:name w:val="Verbatim Char"/>
     <w:basedOn w:val="ad"/>
+    <w:uiPriority w:val="99"/>
     <w:rPr>
       <w:rFonts w:ascii="Consolas" w:eastAsia="宋体" w:hAnsi="Consolas"/>
       <w:sz w:val="22"/>
@@ -2183,6 +2198,7 @@
   <w:style w:type="character" w:customStyle="1" w:styleId="SectionNumber">
     <w:name w:val="Section Number"/>
     <w:basedOn w:val="ad"/>
+    <w:uiPriority w:val="99"/>
     <w:rPr>
       <w:rFonts w:ascii="Times New Roman" w:eastAsia="宋体" w:hAnsi="Times New Roman"/>
     </w:rPr>
@@ -2190,6 +2206,7 @@
   <w:style w:type="character" w:styleId="ae">
     <w:name w:val="footnote reference"/>
     <w:basedOn w:val="ad"/>
+    <w:uiPriority w:val="99"/>
     <w:rPr>
       <w:rFonts w:ascii="Times New Roman" w:eastAsia="宋体" w:hAnsi="Times New Roman"/>
       <w:vertAlign w:val="superscript"/>
@@ -2198,6 +2215,7 @@
   <w:style w:type="character" w:styleId="af">
     <w:name w:val="Hyperlink"/>
     <w:basedOn w:val="ad"/>
+    <w:uiPriority w:val="99"/>
     <w:rPr>
       <w:rFonts w:ascii="Times New Roman" w:eastAsia="宋体" w:hAnsi="Times New Roman"/>
       <w:color w:val="156082" w:themeColor="accent1"/>
@@ -2219,6 +2237,7 @@
     <w:name w:val="header"/>
     <w:basedOn w:val="a"/>
     <w:link w:val="af1"/>
+    <w:uiPriority w:val="99"/>
     <w:pPr>
       <w:tabs>
         <w:tab w:val="center" w:pos="4153"/>
@@ -2236,6 +2255,7 @@
     <w:name w:val="页眉 字符"/>
     <w:basedOn w:val="a1"/>
     <w:link w:val="af0"/>
+    <w:uiPriority w:val="99"/>
     <w:rPr>
       <w:rFonts w:ascii="Times New Roman" w:eastAsia="宋体" w:hAnsi="Times New Roman"/>
       <w:sz w:val="18"/>
@@ -2246,6 +2266,7 @@
     <w:name w:val="footer"/>
     <w:basedOn w:val="a"/>
     <w:link w:val="af3"/>
+    <w:uiPriority w:val="99"/>
     <w:pPr>
       <w:tabs>
         <w:tab w:val="center" w:pos="4153"/>
@@ -2263,6 +2284,7 @@
     <w:name w:val="页脚 字符"/>
     <w:basedOn w:val="a1"/>
     <w:link w:val="af2"/>
+    <w:uiPriority w:val="99"/>
     <w:rPr>
       <w:rFonts w:ascii="Times New Roman" w:eastAsia="宋体" w:hAnsi="Times New Roman"/>
       <w:sz w:val="18"/>
@@ -2272,6 +2294,7 @@
   <w:style w:type="character" w:styleId="af4">
     <w:name w:val="line number"/>
     <w:basedOn w:val="a1"/>
+    <w:uiPriority w:val="99"/>
     <w:rPr>
       <w:rFonts w:ascii="Times New Roman" w:eastAsia="Times New Roman" w:hAnsi="Times New Roman"/>
       <w:sz w:val="24"/>
@@ -2292,6 +2315,7 @@
   <w:style w:type="paragraph" w:customStyle="1" w:styleId="ReplytoReviewers">
     <w:name w:val="Reply to Reviewers"/>
     <w:basedOn w:val="a0"/>
+    <w:uiPriority w:val="99"/>
     <w:rPr>
       <w:color w:val="0000FF"/>
     </w:rPr>
@@ -2299,6 +2323,7 @@
   <w:style w:type="paragraph" w:customStyle="1" w:styleId="ReplyHeader">
     <w:name w:val="Reply Header"/>
     <w:basedOn w:val="a0"/>
+    <w:uiPriority w:val="99"/>
     <w:pPr>
       <w:spacing w:before="0" w:after="0"/>
     </w:pPr>
@@ -2331,6 +2356,7 @@
     <w:name w:val="Revision Para"/>
     <w:basedOn w:val="a0"/>
     <w:next w:val="a0"/>
+    <w:uiPriority w:val="99"/>
     <w:rPr>
       <w:color w:val="EE0000"/>
     </w:rPr>
@@ -2340,6 +2366,7 @@
     <w:basedOn w:val="a"/>
     <w:next w:val="a"/>
     <w:link w:val="af6"/>
+    <w:uiPriority w:val="99"/>
     <w:semiHidden/>
     <w:unhideWhenUsed/>
     <w:qFormat/>
@@ -2351,6 +2378,7 @@
   <w:style w:type="character" w:styleId="af6">
     <w:name w:val="page number"/>
     <w:basedOn w:val="a1"/>
+    <w:uiPriority w:val="99"/>
     <w:rPr>
       <w:rFonts w:ascii="Times New Roman" w:hAnsi="Times New Roman"/>
       <w:sz w:val="21"/>
@@ -2434,6 +2462,7 @@
     <w:name w:val="式中"/>
     <w:basedOn w:val="a0"/>
     <w:next w:val="a0"/>
+    <w:uiPriority w:val="99"/>
     <w:semiHidden/>
     <w:unhideWhenUsed/>
     <w:qFormat/>
@@ -2478,6 +2507,7 @@
     <w:basedOn w:val="a"/>
     <w:next w:val="a"/>
     <w:autoRedefine/>
+    <w:uiPriority w:val="99"/>
     <w:pPr>
       <w:ind w:leftChars="450" w:left="450"/>
     </w:pPr>
@@ -2502,6 +2532,7 @@
     <w:name w:val="table of figures"/>
     <w:basedOn w:val="a"/>
     <w:next w:val="a"/>
+    <w:uiPriority w:val="99"/>
     <w:pPr>
       <w:ind w:left="200" w:hangingChars="200" w:hanging="200"/>
     </w:pPr>

</xml_diff>

<commit_message>
style(styles): add numbering properties to multiple paragraph styles
</commit_message>
<xml_diff>
--- a/reference-doc.docx
+++ b/reference-doc.docx
@@ -2228,6 +2228,9 @@
     <w:uiPriority w:val="10"/>
     <w:qFormat/>
     <w:pPr>
+      <w:numPr>
+        <w:numId w:val="0"/>
+      </w:numPr>
       <w:spacing w:before="240" w:line="259" w:lineRule="auto"/>
       <w:jc w:val="center"/>
       <w:outlineLvl w:val="9"/>
@@ -2478,6 +2481,9 @@
     <w:autoRedefine/>
     <w:uiPriority w:val="39"/>
     <w:pPr>
+      <w:numPr>
+        <w:numId w:val="0"/>
+      </w:numPr>
       <w:spacing w:before="0" w:after="0"/>
       <w:ind w:leftChars="150" w:left="150"/>
     </w:pPr>
@@ -2492,6 +2498,9 @@
     <w:autoRedefine/>
     <w:uiPriority w:val="39"/>
     <w:pPr>
+      <w:numPr>
+        <w:numId w:val="0"/>
+      </w:numPr>
       <w:tabs>
         <w:tab w:val="right" w:leader="dot" w:pos="9736"/>
       </w:tabs>
@@ -2509,6 +2518,9 @@
     <w:autoRedefine/>
     <w:uiPriority w:val="99"/>
     <w:pPr>
+      <w:numPr>
+        <w:numId w:val="0"/>
+      </w:numPr>
       <w:ind w:leftChars="450" w:left="450"/>
     </w:pPr>
   </w:style>
@@ -2519,6 +2531,9 @@
     <w:autoRedefine/>
     <w:uiPriority w:val="39"/>
     <w:pPr>
+      <w:numPr>
+        <w:numId w:val="0"/>
+      </w:numPr>
       <w:tabs>
         <w:tab w:val="right" w:leader="dot" w:pos="9736"/>
       </w:tabs>

</xml_diff>